<commit_message>
refactor: improve payment processing logic and enhance tax calculation descriptions
</commit_message>
<xml_diff>
--- a/TH_Tuan02/Baocao_22650381_LamNgocThanhPhu.docx
+++ b/TH_Tuan02/Baocao_22650381_LamNgocThanhPhu.docx
@@ -2341,6 +2341,7 @@
     </w:p>
     <w:p>
       <w:pPr>
+        <w:pStyle w:val="Heading2"/>
         <w:rPr>
           <w:lang w:val="en-US"/>
         </w:rPr>
@@ -2703,6 +2704,2245 @@
                     <a:xfrm>
                       <a:off x="0" y="0"/>
                       <a:ext cx="3053874" cy="2106716"/>
+                    </a:xfrm>
+                    <a:prstGeom prst="rect">
+                      <a:avLst/>
+                    </a:prstGeom>
+                  </pic:spPr>
+                </pic:pic>
+              </a:graphicData>
+            </a:graphic>
+          </wp:inline>
+        </w:drawing>
+      </w:r>
+    </w:p>
+    <w:p>
+      <w:pPr>
+        <w:ind w:firstLine="272"/>
+        <w:rPr>
+          <w:lang w:val="en-US"/>
+        </w:rPr>
+      </w:pPr>
+      <w:r>
+        <w:rPr>
+          <w:lang w:val="en-US"/>
+        </w:rPr>
+        <w:br w:type="page"/>
+      </w:r>
+    </w:p>
+    <w:p>
+      <w:pPr>
+        <w:pStyle w:val="Heading1"/>
+      </w:pPr>
+      <w:r>
+        <w:lastRenderedPageBreak/>
+        <w:t>2. Tính toán thuế cho sản phẩm</w:t>
+      </w:r>
+    </w:p>
+    <w:tbl>
+      <w:tblPr>
+        <w:tblW w:w="0" w:type="dxa"/>
+        <w:tblCellMar>
+          <w:left w:w="0" w:type="dxa"/>
+          <w:right w:w="0" w:type="dxa"/>
+        </w:tblCellMar>
+        <w:tblLook w:val="04A0" w:firstRow="1" w:lastRow="0" w:firstColumn="1" w:lastColumn="0" w:noHBand="0" w:noVBand="1"/>
+      </w:tblPr>
+      <w:tblGrid>
+        <w:gridCol w:w="1766"/>
+        <w:gridCol w:w="7203"/>
+        <w:gridCol w:w="125"/>
+        <w:gridCol w:w="125"/>
+        <w:gridCol w:w="125"/>
+      </w:tblGrid>
+      <w:tr>
+        <w:trPr>
+          <w:trHeight w:val="315"/>
+        </w:trPr>
+        <w:tc>
+          <w:tcPr>
+            <w:tcW w:w="0" w:type="auto"/>
+            <w:tcBorders>
+              <w:top w:val="single" w:sz="6" w:space="0" w:color="CCCCCC"/>
+              <w:left w:val="single" w:sz="6" w:space="0" w:color="CCCCCC"/>
+              <w:bottom w:val="single" w:sz="6" w:space="0" w:color="CCCCCC"/>
+              <w:right w:val="single" w:sz="6" w:space="0" w:color="CCCCCC"/>
+            </w:tcBorders>
+            <w:tcMar>
+              <w:top w:w="30" w:type="dxa"/>
+              <w:left w:w="0" w:type="dxa"/>
+              <w:bottom w:w="30" w:type="dxa"/>
+              <w:right w:w="0" w:type="dxa"/>
+            </w:tcMar>
+            <w:vAlign w:val="bottom"/>
+            <w:hideMark/>
+          </w:tcPr>
+          <w:p>
+            <w:r>
+              <w:t>2. Tính toán thuế cho sản phẩm</w:t>
+            </w:r>
+          </w:p>
+        </w:tc>
+        <w:tc>
+          <w:tcPr>
+            <w:tcW w:w="0" w:type="auto"/>
+            <w:tcBorders>
+              <w:top w:val="single" w:sz="6" w:space="0" w:color="CCCCCC"/>
+              <w:left w:val="single" w:sz="6" w:space="0" w:color="CCCCCC"/>
+              <w:bottom w:val="single" w:sz="6" w:space="0" w:color="CCCCCC"/>
+              <w:right w:val="single" w:sz="6" w:space="0" w:color="CCCCCC"/>
+            </w:tcBorders>
+            <w:tcMar>
+              <w:top w:w="30" w:type="dxa"/>
+              <w:left w:w="45" w:type="dxa"/>
+              <w:bottom w:w="30" w:type="dxa"/>
+              <w:right w:w="45" w:type="dxa"/>
+            </w:tcMar>
+            <w:vAlign w:val="bottom"/>
+            <w:hideMark/>
+          </w:tcPr>
+          <w:p/>
+        </w:tc>
+        <w:tc>
+          <w:tcPr>
+            <w:tcW w:w="0" w:type="auto"/>
+            <w:tcBorders>
+              <w:top w:val="single" w:sz="6" w:space="0" w:color="CCCCCC"/>
+              <w:left w:val="single" w:sz="6" w:space="0" w:color="CCCCCC"/>
+              <w:bottom w:val="single" w:sz="6" w:space="0" w:color="CCCCCC"/>
+              <w:right w:val="single" w:sz="6" w:space="0" w:color="CCCCCC"/>
+            </w:tcBorders>
+            <w:tcMar>
+              <w:top w:w="30" w:type="dxa"/>
+              <w:left w:w="45" w:type="dxa"/>
+              <w:bottom w:w="30" w:type="dxa"/>
+              <w:right w:w="45" w:type="dxa"/>
+            </w:tcMar>
+            <w:vAlign w:val="bottom"/>
+            <w:hideMark/>
+          </w:tcPr>
+          <w:p/>
+        </w:tc>
+        <w:tc>
+          <w:tcPr>
+            <w:tcW w:w="0" w:type="auto"/>
+            <w:tcBorders>
+              <w:top w:val="single" w:sz="6" w:space="0" w:color="CCCCCC"/>
+              <w:left w:val="single" w:sz="6" w:space="0" w:color="CCCCCC"/>
+              <w:bottom w:val="single" w:sz="6" w:space="0" w:color="CCCCCC"/>
+              <w:right w:val="single" w:sz="6" w:space="0" w:color="CCCCCC"/>
+            </w:tcBorders>
+            <w:tcMar>
+              <w:top w:w="30" w:type="dxa"/>
+              <w:left w:w="45" w:type="dxa"/>
+              <w:bottom w:w="30" w:type="dxa"/>
+              <w:right w:w="45" w:type="dxa"/>
+            </w:tcMar>
+            <w:vAlign w:val="bottom"/>
+            <w:hideMark/>
+          </w:tcPr>
+          <w:p/>
+        </w:tc>
+        <w:tc>
+          <w:tcPr>
+            <w:tcW w:w="0" w:type="auto"/>
+            <w:tcBorders>
+              <w:top w:val="single" w:sz="6" w:space="0" w:color="CCCCCC"/>
+              <w:left w:val="single" w:sz="6" w:space="0" w:color="CCCCCC"/>
+              <w:bottom w:val="single" w:sz="6" w:space="0" w:color="CCCCCC"/>
+              <w:right w:val="single" w:sz="6" w:space="0" w:color="000000"/>
+            </w:tcBorders>
+            <w:tcMar>
+              <w:top w:w="30" w:type="dxa"/>
+              <w:left w:w="45" w:type="dxa"/>
+              <w:bottom w:w="30" w:type="dxa"/>
+              <w:right w:w="45" w:type="dxa"/>
+            </w:tcMar>
+            <w:vAlign w:val="bottom"/>
+            <w:hideMark/>
+          </w:tcPr>
+          <w:p/>
+        </w:tc>
+      </w:tr>
+      <w:tr>
+        <w:trPr>
+          <w:trHeight w:val="315"/>
+        </w:trPr>
+        <w:tc>
+          <w:tcPr>
+            <w:tcW w:w="0" w:type="auto"/>
+            <w:tcBorders>
+              <w:top w:val="single" w:sz="6" w:space="0" w:color="CCCCCC"/>
+              <w:left w:val="single" w:sz="6" w:space="0" w:color="CCCCCC"/>
+              <w:bottom w:val="single" w:sz="6" w:space="0" w:color="CCCCCC"/>
+              <w:right w:val="single" w:sz="6" w:space="0" w:color="CCCCCC"/>
+            </w:tcBorders>
+            <w:tcMar>
+              <w:top w:w="30" w:type="dxa"/>
+              <w:left w:w="45" w:type="dxa"/>
+              <w:bottom w:w="30" w:type="dxa"/>
+              <w:right w:w="45" w:type="dxa"/>
+            </w:tcMar>
+            <w:vAlign w:val="bottom"/>
+            <w:hideMark/>
+          </w:tcPr>
+          <w:p/>
+        </w:tc>
+        <w:tc>
+          <w:tcPr>
+            <w:tcW w:w="0" w:type="auto"/>
+            <w:tcBorders>
+              <w:top w:val="single" w:sz="6" w:space="0" w:color="CCCCCC"/>
+              <w:left w:val="single" w:sz="6" w:space="0" w:color="CCCCCC"/>
+              <w:bottom w:val="single" w:sz="6" w:space="0" w:color="CCCCCC"/>
+              <w:right w:val="single" w:sz="6" w:space="0" w:color="CCCCCC"/>
+            </w:tcBorders>
+            <w:tcMar>
+              <w:top w:w="30" w:type="dxa"/>
+              <w:left w:w="45" w:type="dxa"/>
+              <w:bottom w:w="30" w:type="dxa"/>
+              <w:right w:w="45" w:type="dxa"/>
+            </w:tcMar>
+            <w:vAlign w:val="bottom"/>
+            <w:hideMark/>
+          </w:tcPr>
+          <w:p>
+            <w:r>
+              <w:t>Mô tả:</w:t>
+            </w:r>
+          </w:p>
+        </w:tc>
+        <w:tc>
+          <w:tcPr>
+            <w:tcW w:w="0" w:type="auto"/>
+            <w:tcBorders>
+              <w:top w:val="single" w:sz="6" w:space="0" w:color="CCCCCC"/>
+              <w:left w:val="single" w:sz="6" w:space="0" w:color="CCCCCC"/>
+              <w:bottom w:val="single" w:sz="6" w:space="0" w:color="CCCCCC"/>
+              <w:right w:val="single" w:sz="6" w:space="0" w:color="CCCCCC"/>
+            </w:tcBorders>
+            <w:tcMar>
+              <w:top w:w="30" w:type="dxa"/>
+              <w:left w:w="45" w:type="dxa"/>
+              <w:bottom w:w="30" w:type="dxa"/>
+              <w:right w:w="45" w:type="dxa"/>
+            </w:tcMar>
+            <w:vAlign w:val="bottom"/>
+            <w:hideMark/>
+          </w:tcPr>
+          <w:p/>
+        </w:tc>
+        <w:tc>
+          <w:tcPr>
+            <w:tcW w:w="0" w:type="auto"/>
+            <w:tcBorders>
+              <w:top w:val="single" w:sz="6" w:space="0" w:color="CCCCCC"/>
+              <w:left w:val="single" w:sz="6" w:space="0" w:color="CCCCCC"/>
+              <w:bottom w:val="single" w:sz="6" w:space="0" w:color="CCCCCC"/>
+              <w:right w:val="single" w:sz="6" w:space="0" w:color="CCCCCC"/>
+            </w:tcBorders>
+            <w:tcMar>
+              <w:top w:w="30" w:type="dxa"/>
+              <w:left w:w="45" w:type="dxa"/>
+              <w:bottom w:w="30" w:type="dxa"/>
+              <w:right w:w="45" w:type="dxa"/>
+            </w:tcMar>
+            <w:vAlign w:val="bottom"/>
+            <w:hideMark/>
+          </w:tcPr>
+          <w:p/>
+        </w:tc>
+        <w:tc>
+          <w:tcPr>
+            <w:tcW w:w="0" w:type="auto"/>
+            <w:tcBorders>
+              <w:top w:val="single" w:sz="6" w:space="0" w:color="CCCCCC"/>
+              <w:left w:val="single" w:sz="6" w:space="0" w:color="CCCCCC"/>
+              <w:bottom w:val="single" w:sz="6" w:space="0" w:color="CCCCCC"/>
+              <w:right w:val="single" w:sz="6" w:space="0" w:color="000000"/>
+            </w:tcBorders>
+            <w:tcMar>
+              <w:top w:w="30" w:type="dxa"/>
+              <w:left w:w="45" w:type="dxa"/>
+              <w:bottom w:w="30" w:type="dxa"/>
+              <w:right w:w="45" w:type="dxa"/>
+            </w:tcMar>
+            <w:vAlign w:val="bottom"/>
+            <w:hideMark/>
+          </w:tcPr>
+          <w:p/>
+        </w:tc>
+      </w:tr>
+      <w:tr>
+        <w:trPr>
+          <w:trHeight w:val="315"/>
+        </w:trPr>
+        <w:tc>
+          <w:tcPr>
+            <w:tcW w:w="0" w:type="auto"/>
+            <w:tcBorders>
+              <w:top w:val="single" w:sz="6" w:space="0" w:color="CCCCCC"/>
+              <w:left w:val="single" w:sz="6" w:space="0" w:color="CCCCCC"/>
+              <w:bottom w:val="single" w:sz="6" w:space="0" w:color="CCCCCC"/>
+              <w:right w:val="single" w:sz="6" w:space="0" w:color="CCCCCC"/>
+            </w:tcBorders>
+            <w:tcMar>
+              <w:top w:w="30" w:type="dxa"/>
+              <w:left w:w="45" w:type="dxa"/>
+              <w:bottom w:w="30" w:type="dxa"/>
+              <w:right w:w="45" w:type="dxa"/>
+            </w:tcMar>
+            <w:vAlign w:val="bottom"/>
+            <w:hideMark/>
+          </w:tcPr>
+          <w:p/>
+        </w:tc>
+        <w:tc>
+          <w:tcPr>
+            <w:tcW w:w="0" w:type="auto"/>
+            <w:tcBorders>
+              <w:top w:val="single" w:sz="6" w:space="0" w:color="CCCCCC"/>
+              <w:left w:val="single" w:sz="6" w:space="0" w:color="CCCCCC"/>
+              <w:bottom w:val="single" w:sz="6" w:space="0" w:color="CCCCCC"/>
+              <w:right w:val="single" w:sz="6" w:space="0" w:color="CCCCCC"/>
+            </w:tcBorders>
+            <w:tcMar>
+              <w:top w:w="30" w:type="dxa"/>
+              <w:left w:w="0" w:type="dxa"/>
+              <w:bottom w:w="30" w:type="dxa"/>
+              <w:right w:w="0" w:type="dxa"/>
+            </w:tcMar>
+            <w:vAlign w:val="bottom"/>
+            <w:hideMark/>
+          </w:tcPr>
+          <w:p>
+            <w:r>
+              <w:t>Giả sử bạn có một hệ thống bán hàng và muốn tính toán thuế cho các sản phẩm khác nhau.</w:t>
+            </w:r>
+          </w:p>
+        </w:tc>
+        <w:tc>
+          <w:tcPr>
+            <w:tcW w:w="0" w:type="auto"/>
+            <w:tcBorders>
+              <w:top w:val="single" w:sz="6" w:space="0" w:color="CCCCCC"/>
+              <w:left w:val="single" w:sz="6" w:space="0" w:color="CCCCCC"/>
+              <w:bottom w:val="single" w:sz="6" w:space="0" w:color="CCCCCC"/>
+              <w:right w:val="single" w:sz="6" w:space="0" w:color="CCCCCC"/>
+            </w:tcBorders>
+            <w:tcMar>
+              <w:top w:w="30" w:type="dxa"/>
+              <w:left w:w="45" w:type="dxa"/>
+              <w:bottom w:w="30" w:type="dxa"/>
+              <w:right w:w="45" w:type="dxa"/>
+            </w:tcMar>
+            <w:vAlign w:val="bottom"/>
+            <w:hideMark/>
+          </w:tcPr>
+          <w:p/>
+        </w:tc>
+        <w:tc>
+          <w:tcPr>
+            <w:tcW w:w="0" w:type="auto"/>
+            <w:tcBorders>
+              <w:top w:val="single" w:sz="6" w:space="0" w:color="CCCCCC"/>
+              <w:left w:val="single" w:sz="6" w:space="0" w:color="CCCCCC"/>
+              <w:bottom w:val="single" w:sz="6" w:space="0" w:color="CCCCCC"/>
+              <w:right w:val="single" w:sz="6" w:space="0" w:color="CCCCCC"/>
+            </w:tcBorders>
+            <w:tcMar>
+              <w:top w:w="30" w:type="dxa"/>
+              <w:left w:w="45" w:type="dxa"/>
+              <w:bottom w:w="30" w:type="dxa"/>
+              <w:right w:w="45" w:type="dxa"/>
+            </w:tcMar>
+            <w:vAlign w:val="bottom"/>
+            <w:hideMark/>
+          </w:tcPr>
+          <w:p/>
+        </w:tc>
+        <w:tc>
+          <w:tcPr>
+            <w:tcW w:w="0" w:type="auto"/>
+            <w:tcBorders>
+              <w:top w:val="single" w:sz="6" w:space="0" w:color="CCCCCC"/>
+              <w:left w:val="single" w:sz="6" w:space="0" w:color="CCCCCC"/>
+              <w:bottom w:val="single" w:sz="6" w:space="0" w:color="CCCCCC"/>
+              <w:right w:val="single" w:sz="6" w:space="0" w:color="000000"/>
+            </w:tcBorders>
+            <w:tcMar>
+              <w:top w:w="30" w:type="dxa"/>
+              <w:left w:w="45" w:type="dxa"/>
+              <w:bottom w:w="30" w:type="dxa"/>
+              <w:right w:w="45" w:type="dxa"/>
+            </w:tcMar>
+            <w:vAlign w:val="bottom"/>
+            <w:hideMark/>
+          </w:tcPr>
+          <w:p/>
+        </w:tc>
+      </w:tr>
+      <w:tr>
+        <w:trPr>
+          <w:trHeight w:val="315"/>
+        </w:trPr>
+        <w:tc>
+          <w:tcPr>
+            <w:tcW w:w="0" w:type="auto"/>
+            <w:tcBorders>
+              <w:top w:val="single" w:sz="6" w:space="0" w:color="CCCCCC"/>
+              <w:left w:val="single" w:sz="6" w:space="0" w:color="CCCCCC"/>
+              <w:bottom w:val="single" w:sz="6" w:space="0" w:color="CCCCCC"/>
+              <w:right w:val="single" w:sz="6" w:space="0" w:color="CCCCCC"/>
+            </w:tcBorders>
+            <w:tcMar>
+              <w:top w:w="30" w:type="dxa"/>
+              <w:left w:w="45" w:type="dxa"/>
+              <w:bottom w:w="30" w:type="dxa"/>
+              <w:right w:w="45" w:type="dxa"/>
+            </w:tcMar>
+            <w:vAlign w:val="bottom"/>
+            <w:hideMark/>
+          </w:tcPr>
+          <w:p/>
+        </w:tc>
+        <w:tc>
+          <w:tcPr>
+            <w:tcW w:w="0" w:type="auto"/>
+            <w:gridSpan w:val="4"/>
+            <w:tcBorders>
+              <w:top w:val="single" w:sz="6" w:space="0" w:color="CCCCCC"/>
+              <w:left w:val="single" w:sz="6" w:space="0" w:color="CCCCCC"/>
+              <w:bottom w:val="single" w:sz="6" w:space="0" w:color="CCCCCC"/>
+              <w:right w:val="single" w:sz="6" w:space="0" w:color="000000"/>
+            </w:tcBorders>
+            <w:tcMar>
+              <w:top w:w="30" w:type="dxa"/>
+              <w:left w:w="45" w:type="dxa"/>
+              <w:bottom w:w="30" w:type="dxa"/>
+              <w:right w:w="45" w:type="dxa"/>
+            </w:tcMar>
+            <w:vAlign w:val="bottom"/>
+            <w:hideMark/>
+          </w:tcPr>
+          <w:p>
+            <w:r>
+              <w:t>Các sản phẩm có thể áp dụng các loại thuế khác nhau, ví dụ như thuế tiêu thụ, thuế giá trị gia tăng (VAT), hoặc thuế đặc biệt cho các sản phẩm xa xỉ.</w:t>
+            </w:r>
+          </w:p>
+        </w:tc>
+      </w:tr>
+      <w:tr>
+        <w:trPr>
+          <w:trHeight w:val="315"/>
+        </w:trPr>
+        <w:tc>
+          <w:tcPr>
+            <w:tcW w:w="0" w:type="auto"/>
+            <w:tcBorders>
+              <w:top w:val="single" w:sz="6" w:space="0" w:color="CCCCCC"/>
+              <w:left w:val="single" w:sz="6" w:space="0" w:color="CCCCCC"/>
+              <w:bottom w:val="single" w:sz="6" w:space="0" w:color="CCCCCC"/>
+              <w:right w:val="single" w:sz="6" w:space="0" w:color="CCCCCC"/>
+            </w:tcBorders>
+            <w:tcMar>
+              <w:top w:w="30" w:type="dxa"/>
+              <w:left w:w="45" w:type="dxa"/>
+              <w:bottom w:w="30" w:type="dxa"/>
+              <w:right w:w="45" w:type="dxa"/>
+            </w:tcMar>
+            <w:vAlign w:val="bottom"/>
+            <w:hideMark/>
+          </w:tcPr>
+          <w:p/>
+        </w:tc>
+        <w:tc>
+          <w:tcPr>
+            <w:tcW w:w="0" w:type="auto"/>
+            <w:tcBorders>
+              <w:top w:val="single" w:sz="6" w:space="0" w:color="CCCCCC"/>
+              <w:left w:val="single" w:sz="6" w:space="0" w:color="CCCCCC"/>
+              <w:bottom w:val="single" w:sz="6" w:space="0" w:color="CCCCCC"/>
+              <w:right w:val="single" w:sz="6" w:space="0" w:color="CCCCCC"/>
+            </w:tcBorders>
+            <w:tcMar>
+              <w:top w:w="30" w:type="dxa"/>
+              <w:left w:w="45" w:type="dxa"/>
+              <w:bottom w:w="30" w:type="dxa"/>
+              <w:right w:w="45" w:type="dxa"/>
+            </w:tcMar>
+            <w:vAlign w:val="bottom"/>
+            <w:hideMark/>
+          </w:tcPr>
+          <w:p/>
+        </w:tc>
+        <w:tc>
+          <w:tcPr>
+            <w:tcW w:w="0" w:type="auto"/>
+            <w:tcBorders>
+              <w:top w:val="single" w:sz="6" w:space="0" w:color="CCCCCC"/>
+              <w:left w:val="single" w:sz="6" w:space="0" w:color="CCCCCC"/>
+              <w:bottom w:val="single" w:sz="6" w:space="0" w:color="CCCCCC"/>
+              <w:right w:val="single" w:sz="6" w:space="0" w:color="CCCCCC"/>
+            </w:tcBorders>
+            <w:tcMar>
+              <w:top w:w="30" w:type="dxa"/>
+              <w:left w:w="45" w:type="dxa"/>
+              <w:bottom w:w="30" w:type="dxa"/>
+              <w:right w:w="45" w:type="dxa"/>
+            </w:tcMar>
+            <w:vAlign w:val="bottom"/>
+            <w:hideMark/>
+          </w:tcPr>
+          <w:p/>
+        </w:tc>
+        <w:tc>
+          <w:tcPr>
+            <w:tcW w:w="0" w:type="auto"/>
+            <w:tcBorders>
+              <w:top w:val="single" w:sz="6" w:space="0" w:color="CCCCCC"/>
+              <w:left w:val="single" w:sz="6" w:space="0" w:color="CCCCCC"/>
+              <w:bottom w:val="single" w:sz="6" w:space="0" w:color="CCCCCC"/>
+              <w:right w:val="single" w:sz="6" w:space="0" w:color="CCCCCC"/>
+            </w:tcBorders>
+            <w:tcMar>
+              <w:top w:w="30" w:type="dxa"/>
+              <w:left w:w="45" w:type="dxa"/>
+              <w:bottom w:w="30" w:type="dxa"/>
+              <w:right w:w="45" w:type="dxa"/>
+            </w:tcMar>
+            <w:vAlign w:val="bottom"/>
+            <w:hideMark/>
+          </w:tcPr>
+          <w:p/>
+        </w:tc>
+        <w:tc>
+          <w:tcPr>
+            <w:tcW w:w="0" w:type="auto"/>
+            <w:tcBorders>
+              <w:top w:val="single" w:sz="6" w:space="0" w:color="CCCCCC"/>
+              <w:left w:val="single" w:sz="6" w:space="0" w:color="CCCCCC"/>
+              <w:bottom w:val="single" w:sz="6" w:space="0" w:color="CCCCCC"/>
+              <w:right w:val="single" w:sz="6" w:space="0" w:color="000000"/>
+            </w:tcBorders>
+            <w:tcMar>
+              <w:top w:w="30" w:type="dxa"/>
+              <w:left w:w="45" w:type="dxa"/>
+              <w:bottom w:w="30" w:type="dxa"/>
+              <w:right w:w="45" w:type="dxa"/>
+            </w:tcMar>
+            <w:vAlign w:val="bottom"/>
+            <w:hideMark/>
+          </w:tcPr>
+          <w:p/>
+        </w:tc>
+      </w:tr>
+      <w:tr>
+        <w:trPr>
+          <w:trHeight w:val="315"/>
+        </w:trPr>
+        <w:tc>
+          <w:tcPr>
+            <w:tcW w:w="0" w:type="auto"/>
+            <w:tcBorders>
+              <w:top w:val="single" w:sz="6" w:space="0" w:color="CCCCCC"/>
+              <w:left w:val="single" w:sz="6" w:space="0" w:color="CCCCCC"/>
+              <w:bottom w:val="single" w:sz="6" w:space="0" w:color="CCCCCC"/>
+              <w:right w:val="single" w:sz="6" w:space="0" w:color="CCCCCC"/>
+            </w:tcBorders>
+            <w:tcMar>
+              <w:top w:w="30" w:type="dxa"/>
+              <w:left w:w="45" w:type="dxa"/>
+              <w:bottom w:w="30" w:type="dxa"/>
+              <w:right w:w="45" w:type="dxa"/>
+            </w:tcMar>
+            <w:vAlign w:val="bottom"/>
+            <w:hideMark/>
+          </w:tcPr>
+          <w:p/>
+        </w:tc>
+        <w:tc>
+          <w:tcPr>
+            <w:tcW w:w="0" w:type="auto"/>
+            <w:gridSpan w:val="4"/>
+            <w:tcBorders>
+              <w:top w:val="single" w:sz="6" w:space="0" w:color="CCCCCC"/>
+              <w:left w:val="single" w:sz="6" w:space="0" w:color="CCCCCC"/>
+              <w:bottom w:val="single" w:sz="6" w:space="0" w:color="CCCCCC"/>
+              <w:right w:val="single" w:sz="6" w:space="0" w:color="000000"/>
+            </w:tcBorders>
+            <w:tcMar>
+              <w:top w:w="30" w:type="dxa"/>
+              <w:left w:w="45" w:type="dxa"/>
+              <w:bottom w:w="30" w:type="dxa"/>
+              <w:right w:w="45" w:type="dxa"/>
+            </w:tcMar>
+            <w:vAlign w:val="bottom"/>
+            <w:hideMark/>
+          </w:tcPr>
+          <w:p>
+            <w:r>
+              <w:t>Hãy dùng các Design Pattern: State, Strategy, Decorator viết bằng Java để xử lý mô phỏng trường hợp trên và đưa ra kết luận.</w:t>
+            </w:r>
+          </w:p>
+        </w:tc>
+      </w:tr>
+    </w:tbl>
+    <w:p>
+      <w:pPr>
+        <w:pStyle w:val="Heading2"/>
+        <w:rPr>
+          <w:lang w:val="en-US"/>
+        </w:rPr>
+      </w:pPr>
+      <w:r>
+        <w:rPr>
+          <w:lang w:val="en-US"/>
+        </w:rPr>
+        <w:t>State Pattern</w:t>
+      </w:r>
+    </w:p>
+    <w:p>
+      <w:pPr>
+        <w:rPr>
+          <w:b/>
+          <w:bCs/>
+        </w:rPr>
+      </w:pPr>
+      <w:r>
+        <w:rPr>
+          <w:b/>
+          <w:bCs/>
+        </w:rPr>
+        <w:t>OrderTaxState (Interface - State)</w:t>
+      </w:r>
+    </w:p>
+    <w:p>
+      <w:r>
+        <w:t>Vai trò: Định nghĩa hợp đồng cho tất cả các trạng thái cụ thể.</w:t>
+      </w:r>
+    </w:p>
+    <w:p>
+      <w:pPr>
+        <w:rPr>
+          <w:b/>
+          <w:bCs/>
+        </w:rPr>
+      </w:pPr>
+      <w:r>
+        <w:rPr>
+          <w:b/>
+          <w:bCs/>
+        </w:rPr>
+        <w:t>TaxOrder (Context)</w:t>
+      </w:r>
+    </w:p>
+    <w:p>
+      <w:r>
+        <w:t>Vai trò: Lưu giữ tham chiếu đến đối tượng state cụ thể định nghĩa trạng thái hiện tại. Đóng gói logic chuyển tiếp.</w:t>
+      </w:r>
+    </w:p>
+    <w:tbl>
+      <w:tblPr>
+        <w:tblW w:w="0" w:type="auto"/>
+        <w:tblCellSpacing w:w="15" w:type="dxa"/>
+        <w:tblBorders>
+          <w:top w:val="single" w:sz="4" w:space="0" w:color="auto"/>
+          <w:left w:val="single" w:sz="4" w:space="0" w:color="auto"/>
+          <w:bottom w:val="single" w:sz="4" w:space="0" w:color="auto"/>
+          <w:right w:val="single" w:sz="4" w:space="0" w:color="auto"/>
+        </w:tblBorders>
+        <w:shd w:val="clear" w:color="auto" w:fill="191A1B"/>
+        <w:tblCellMar>
+          <w:top w:w="15" w:type="dxa"/>
+          <w:left w:w="15" w:type="dxa"/>
+          <w:bottom w:w="15" w:type="dxa"/>
+          <w:right w:w="15" w:type="dxa"/>
+        </w:tblCellMar>
+        <w:tblLook w:val="04A0" w:firstRow="1" w:lastRow="0" w:firstColumn="1" w:lastColumn="0" w:noHBand="0" w:noVBand="1"/>
+      </w:tblPr>
+      <w:tblGrid>
+        <w:gridCol w:w="2563"/>
+        <w:gridCol w:w="1013"/>
+        <w:gridCol w:w="3639"/>
+        <w:gridCol w:w="2145"/>
+      </w:tblGrid>
+      <w:tr>
+        <w:trPr>
+          <w:tblHeader/>
+          <w:tblCellSpacing w:w="15" w:type="dxa"/>
+        </w:trPr>
+        <w:tc>
+          <w:tcPr>
+            <w:tcW w:w="0" w:type="auto"/>
+            <w:tcBorders>
+              <w:top w:val="single" w:sz="4" w:space="0" w:color="auto"/>
+              <w:left w:val="nil"/>
+            </w:tcBorders>
+            <w:tcMar>
+              <w:top w:w="60" w:type="dxa"/>
+              <w:left w:w="90" w:type="dxa"/>
+              <w:bottom w:w="60" w:type="dxa"/>
+              <w:right w:w="90" w:type="dxa"/>
+            </w:tcMar>
+            <w:vAlign w:val="center"/>
+            <w:hideMark/>
+          </w:tcPr>
+          <w:p>
+            <w:pPr>
+              <w:rPr>
+                <w:b/>
+                <w:bCs/>
+              </w:rPr>
+            </w:pPr>
+            <w:r>
+              <w:rPr>
+                <w:b/>
+                <w:bCs/>
+              </w:rPr>
+              <w:t>Trạng thái</w:t>
+            </w:r>
+          </w:p>
+        </w:tc>
+        <w:tc>
+          <w:tcPr>
+            <w:tcW w:w="0" w:type="auto"/>
+            <w:tcBorders>
+              <w:top w:val="single" w:sz="4" w:space="0" w:color="auto"/>
+              <w:left w:val="nil"/>
+            </w:tcBorders>
+            <w:tcMar>
+              <w:top w:w="60" w:type="dxa"/>
+              <w:left w:w="90" w:type="dxa"/>
+              <w:bottom w:w="60" w:type="dxa"/>
+              <w:right w:w="90" w:type="dxa"/>
+            </w:tcMar>
+            <w:vAlign w:val="center"/>
+            <w:hideMark/>
+          </w:tcPr>
+          <w:p>
+            <w:pPr>
+              <w:rPr>
+                <w:b/>
+                <w:bCs/>
+              </w:rPr>
+            </w:pPr>
+            <w:r>
+              <w:rPr>
+                <w:b/>
+                <w:bCs/>
+              </w:rPr>
+              <w:t>Mô tả</w:t>
+            </w:r>
+          </w:p>
+        </w:tc>
+        <w:tc>
+          <w:tcPr>
+            <w:tcW w:w="0" w:type="auto"/>
+            <w:tcBorders>
+              <w:top w:val="single" w:sz="4" w:space="0" w:color="auto"/>
+              <w:left w:val="nil"/>
+            </w:tcBorders>
+            <w:tcMar>
+              <w:top w:w="60" w:type="dxa"/>
+              <w:left w:w="90" w:type="dxa"/>
+              <w:bottom w:w="60" w:type="dxa"/>
+              <w:right w:w="90" w:type="dxa"/>
+            </w:tcMar>
+            <w:vAlign w:val="center"/>
+            <w:hideMark/>
+          </w:tcPr>
+          <w:p>
+            <w:pPr>
+              <w:rPr>
+                <w:b/>
+                <w:bCs/>
+              </w:rPr>
+            </w:pPr>
+            <w:r>
+              <w:rPr>
+                <w:b/>
+                <w:bCs/>
+              </w:rPr>
+              <w:t>Hành vi </w:t>
+            </w:r>
+            <w:hyperlink r:id="rId42" w:history="1">
+              <w:r>
+                <w:rPr>
+                  <w:rStyle w:val="Hyperlink"/>
+                </w:rPr>
+                <w:t>calculateTax()</w:t>
+              </w:r>
+            </w:hyperlink>
+          </w:p>
+        </w:tc>
+        <w:tc>
+          <w:tcPr>
+            <w:tcW w:w="0" w:type="auto"/>
+            <w:tcBorders>
+              <w:top w:val="single" w:sz="4" w:space="0" w:color="auto"/>
+              <w:left w:val="nil"/>
+              <w:right w:val="nil"/>
+            </w:tcBorders>
+            <w:tcMar>
+              <w:top w:w="60" w:type="dxa"/>
+              <w:left w:w="90" w:type="dxa"/>
+              <w:bottom w:w="60" w:type="dxa"/>
+              <w:right w:w="90" w:type="dxa"/>
+            </w:tcMar>
+            <w:vAlign w:val="center"/>
+            <w:hideMark/>
+          </w:tcPr>
+          <w:p>
+            <w:pPr>
+              <w:rPr>
+                <w:b/>
+                <w:bCs/>
+              </w:rPr>
+            </w:pPr>
+            <w:r>
+              <w:rPr>
+                <w:b/>
+                <w:bCs/>
+              </w:rPr>
+              <w:t>Chuyển tiếp</w:t>
+            </w:r>
+          </w:p>
+        </w:tc>
+      </w:tr>
+      <w:tr>
+        <w:trPr>
+          <w:tblCellSpacing w:w="15" w:type="dxa"/>
+        </w:trPr>
+        <w:tc>
+          <w:tcPr>
+            <w:tcW w:w="0" w:type="auto"/>
+            <w:tcBorders>
+              <w:top w:val="nil"/>
+              <w:left w:val="nil"/>
+            </w:tcBorders>
+            <w:tcMar>
+              <w:top w:w="60" w:type="dxa"/>
+              <w:left w:w="90" w:type="dxa"/>
+              <w:bottom w:w="60" w:type="dxa"/>
+              <w:right w:w="90" w:type="dxa"/>
+            </w:tcMar>
+            <w:vAlign w:val="center"/>
+            <w:hideMark/>
+          </w:tcPr>
+          <w:p>
+            <w:r>
+              <w:rPr>
+                <w:b/>
+                <w:bCs/>
+              </w:rPr>
+              <w:t>NewOrderTaxState</w:t>
+            </w:r>
+          </w:p>
+        </w:tc>
+        <w:tc>
+          <w:tcPr>
+            <w:tcW w:w="0" w:type="auto"/>
+            <w:tcBorders>
+              <w:top w:val="nil"/>
+              <w:left w:val="nil"/>
+            </w:tcBorders>
+            <w:tcMar>
+              <w:top w:w="60" w:type="dxa"/>
+              <w:left w:w="90" w:type="dxa"/>
+              <w:bottom w:w="60" w:type="dxa"/>
+              <w:right w:w="90" w:type="dxa"/>
+            </w:tcMar>
+            <w:vAlign w:val="center"/>
+            <w:hideMark/>
+          </w:tcPr>
+          <w:p>
+            <w:r>
+              <w:t>Đơn hàng mới tạo</w:t>
+            </w:r>
+          </w:p>
+        </w:tc>
+        <w:tc>
+          <w:tcPr>
+            <w:tcW w:w="0" w:type="auto"/>
+            <w:tcBorders>
+              <w:top w:val="nil"/>
+              <w:left w:val="nil"/>
+            </w:tcBorders>
+            <w:tcMar>
+              <w:top w:w="60" w:type="dxa"/>
+              <w:left w:w="90" w:type="dxa"/>
+              <w:bottom w:w="60" w:type="dxa"/>
+              <w:right w:w="90" w:type="dxa"/>
+            </w:tcMar>
+            <w:vAlign w:val="center"/>
+            <w:hideMark/>
+          </w:tcPr>
+          <w:p>
+            <w:r>
+              <w:t>Trả về 0 (chưa tính thuế chính thức)</w:t>
+            </w:r>
+          </w:p>
+        </w:tc>
+        <w:tc>
+          <w:tcPr>
+            <w:tcW w:w="0" w:type="auto"/>
+            <w:tcBorders>
+              <w:top w:val="nil"/>
+              <w:left w:val="nil"/>
+              <w:right w:val="nil"/>
+            </w:tcBorders>
+            <w:tcMar>
+              <w:top w:w="60" w:type="dxa"/>
+              <w:left w:w="90" w:type="dxa"/>
+              <w:bottom w:w="60" w:type="dxa"/>
+              <w:right w:w="90" w:type="dxa"/>
+            </w:tcMar>
+            <w:vAlign w:val="center"/>
+            <w:hideMark/>
+          </w:tcPr>
+          <w:p>
+            <w:r>
+              <w:t>→ TaxableOrderState</w:t>
+            </w:r>
+          </w:p>
+        </w:tc>
+      </w:tr>
+      <w:tr>
+        <w:trPr>
+          <w:tblCellSpacing w:w="15" w:type="dxa"/>
+        </w:trPr>
+        <w:tc>
+          <w:tcPr>
+            <w:tcW w:w="0" w:type="auto"/>
+            <w:tcBorders>
+              <w:top w:val="nil"/>
+              <w:left w:val="nil"/>
+            </w:tcBorders>
+            <w:tcMar>
+              <w:top w:w="60" w:type="dxa"/>
+              <w:left w:w="90" w:type="dxa"/>
+              <w:bottom w:w="60" w:type="dxa"/>
+              <w:right w:w="90" w:type="dxa"/>
+            </w:tcMar>
+            <w:vAlign w:val="center"/>
+            <w:hideMark/>
+          </w:tcPr>
+          <w:p>
+            <w:r>
+              <w:rPr>
+                <w:b/>
+                <w:bCs/>
+              </w:rPr>
+              <w:t>TaxableOrderState</w:t>
+            </w:r>
+          </w:p>
+        </w:tc>
+        <w:tc>
+          <w:tcPr>
+            <w:tcW w:w="0" w:type="auto"/>
+            <w:tcBorders>
+              <w:top w:val="nil"/>
+              <w:left w:val="nil"/>
+            </w:tcBorders>
+            <w:tcMar>
+              <w:top w:w="60" w:type="dxa"/>
+              <w:left w:w="90" w:type="dxa"/>
+              <w:bottom w:w="60" w:type="dxa"/>
+              <w:right w:w="90" w:type="dxa"/>
+            </w:tcMar>
+            <w:vAlign w:val="center"/>
+            <w:hideMark/>
+          </w:tcPr>
+          <w:p>
+            <w:r>
+              <w:t>Đơn chịu thuế theo loại</w:t>
+            </w:r>
+          </w:p>
+        </w:tc>
+        <w:tc>
+          <w:tcPr>
+            <w:tcW w:w="0" w:type="auto"/>
+            <w:tcBorders>
+              <w:top w:val="nil"/>
+              <w:left w:val="nil"/>
+            </w:tcBorders>
+            <w:tcMar>
+              <w:top w:w="60" w:type="dxa"/>
+              <w:left w:w="90" w:type="dxa"/>
+              <w:bottom w:w="60" w:type="dxa"/>
+              <w:right w:w="90" w:type="dxa"/>
+            </w:tcMar>
+            <w:vAlign w:val="center"/>
+            <w:hideMark/>
+          </w:tcPr>
+          <w:p>
+            <w:r>
+              <w:t>VAT 10% cho NORMAL; VAT+Excise 25% cho EXCISE; VAT+Excise+Luxury 45% cho LUXURY</w:t>
+            </w:r>
+          </w:p>
+        </w:tc>
+        <w:tc>
+          <w:tcPr>
+            <w:tcW w:w="0" w:type="auto"/>
+            <w:tcBorders>
+              <w:top w:val="nil"/>
+              <w:left w:val="nil"/>
+              <w:right w:val="nil"/>
+            </w:tcBorders>
+            <w:tcMar>
+              <w:top w:w="60" w:type="dxa"/>
+              <w:left w:w="90" w:type="dxa"/>
+              <w:bottom w:w="60" w:type="dxa"/>
+              <w:right w:w="90" w:type="dxa"/>
+            </w:tcMar>
+            <w:vAlign w:val="center"/>
+            <w:hideMark/>
+          </w:tcPr>
+          <w:p>
+            <w:r>
+              <w:t>→ FinalizedTaxState</w:t>
+            </w:r>
+          </w:p>
+        </w:tc>
+      </w:tr>
+      <w:tr>
+        <w:trPr>
+          <w:tblCellSpacing w:w="15" w:type="dxa"/>
+        </w:trPr>
+        <w:tc>
+          <w:tcPr>
+            <w:tcW w:w="0" w:type="auto"/>
+            <w:tcBorders>
+              <w:top w:val="nil"/>
+              <w:left w:val="nil"/>
+            </w:tcBorders>
+            <w:tcMar>
+              <w:top w:w="60" w:type="dxa"/>
+              <w:left w:w="90" w:type="dxa"/>
+              <w:bottom w:w="60" w:type="dxa"/>
+              <w:right w:w="90" w:type="dxa"/>
+            </w:tcMar>
+            <w:vAlign w:val="center"/>
+            <w:hideMark/>
+          </w:tcPr>
+          <w:p>
+            <w:r>
+              <w:rPr>
+                <w:b/>
+                <w:bCs/>
+              </w:rPr>
+              <w:t>ExemptOrderTaxState</w:t>
+            </w:r>
+          </w:p>
+        </w:tc>
+        <w:tc>
+          <w:tcPr>
+            <w:tcW w:w="0" w:type="auto"/>
+            <w:tcBorders>
+              <w:top w:val="nil"/>
+              <w:left w:val="nil"/>
+            </w:tcBorders>
+            <w:tcMar>
+              <w:top w:w="60" w:type="dxa"/>
+              <w:left w:w="90" w:type="dxa"/>
+              <w:bottom w:w="60" w:type="dxa"/>
+              <w:right w:w="90" w:type="dxa"/>
+            </w:tcMar>
+            <w:vAlign w:val="center"/>
+            <w:hideMark/>
+          </w:tcPr>
+          <w:p>
+            <w:r>
+              <w:t>Đơn được miễn thuế</w:t>
+            </w:r>
+          </w:p>
+        </w:tc>
+        <w:tc>
+          <w:tcPr>
+            <w:tcW w:w="0" w:type="auto"/>
+            <w:tcBorders>
+              <w:top w:val="nil"/>
+              <w:left w:val="nil"/>
+            </w:tcBorders>
+            <w:tcMar>
+              <w:top w:w="60" w:type="dxa"/>
+              <w:left w:w="90" w:type="dxa"/>
+              <w:bottom w:w="60" w:type="dxa"/>
+              <w:right w:w="90" w:type="dxa"/>
+            </w:tcMar>
+            <w:vAlign w:val="center"/>
+            <w:hideMark/>
+          </w:tcPr>
+          <w:p>
+            <w:r>
+              <w:t>Trả về 0 (được miễn)</w:t>
+            </w:r>
+          </w:p>
+        </w:tc>
+        <w:tc>
+          <w:tcPr>
+            <w:tcW w:w="0" w:type="auto"/>
+            <w:tcBorders>
+              <w:top w:val="nil"/>
+              <w:left w:val="nil"/>
+              <w:right w:val="nil"/>
+            </w:tcBorders>
+            <w:tcMar>
+              <w:top w:w="60" w:type="dxa"/>
+              <w:left w:w="90" w:type="dxa"/>
+              <w:bottom w:w="60" w:type="dxa"/>
+              <w:right w:w="90" w:type="dxa"/>
+            </w:tcMar>
+            <w:vAlign w:val="center"/>
+            <w:hideMark/>
+          </w:tcPr>
+          <w:p>
+            <w:r>
+              <w:t>→ FinalizedTaxState</w:t>
+            </w:r>
+          </w:p>
+        </w:tc>
+      </w:tr>
+      <w:tr>
+        <w:trPr>
+          <w:tblCellSpacing w:w="15" w:type="dxa"/>
+        </w:trPr>
+        <w:tc>
+          <w:tcPr>
+            <w:tcW w:w="0" w:type="auto"/>
+            <w:tcBorders>
+              <w:top w:val="nil"/>
+              <w:left w:val="nil"/>
+              <w:bottom w:val="nil"/>
+            </w:tcBorders>
+            <w:tcMar>
+              <w:top w:w="60" w:type="dxa"/>
+              <w:left w:w="90" w:type="dxa"/>
+              <w:bottom w:w="60" w:type="dxa"/>
+              <w:right w:w="90" w:type="dxa"/>
+            </w:tcMar>
+            <w:vAlign w:val="center"/>
+            <w:hideMark/>
+          </w:tcPr>
+          <w:p>
+            <w:r>
+              <w:rPr>
+                <w:b/>
+                <w:bCs/>
+              </w:rPr>
+              <w:t>FinalizedTaxState</w:t>
+            </w:r>
+          </w:p>
+        </w:tc>
+        <w:tc>
+          <w:tcPr>
+            <w:tcW w:w="0" w:type="auto"/>
+            <w:tcBorders>
+              <w:top w:val="nil"/>
+              <w:left w:val="nil"/>
+              <w:bottom w:val="nil"/>
+            </w:tcBorders>
+            <w:tcMar>
+              <w:top w:w="60" w:type="dxa"/>
+              <w:left w:w="90" w:type="dxa"/>
+              <w:bottom w:w="60" w:type="dxa"/>
+              <w:right w:w="90" w:type="dxa"/>
+            </w:tcMar>
+            <w:vAlign w:val="center"/>
+            <w:hideMark/>
+          </w:tcPr>
+          <w:p>
+            <w:r>
+              <w:t>Đơn đã chốt</w:t>
+            </w:r>
+          </w:p>
+        </w:tc>
+        <w:tc>
+          <w:tcPr>
+            <w:tcW w:w="0" w:type="auto"/>
+            <w:tcBorders>
+              <w:top w:val="nil"/>
+              <w:left w:val="nil"/>
+              <w:bottom w:val="nil"/>
+            </w:tcBorders>
+            <w:tcMar>
+              <w:top w:w="60" w:type="dxa"/>
+              <w:left w:w="90" w:type="dxa"/>
+              <w:bottom w:w="60" w:type="dxa"/>
+              <w:right w:w="90" w:type="dxa"/>
+            </w:tcMar>
+            <w:vAlign w:val="center"/>
+            <w:hideMark/>
+          </w:tcPr>
+          <w:p>
+            <w:r>
+              <w:t>Trả về giá trị thuế đã lưu (giá trị cuối)</w:t>
+            </w:r>
+          </w:p>
+        </w:tc>
+        <w:tc>
+          <w:tcPr>
+            <w:tcW w:w="0" w:type="auto"/>
+            <w:tcBorders>
+              <w:top w:val="nil"/>
+              <w:left w:val="nil"/>
+              <w:bottom w:val="nil"/>
+              <w:right w:val="nil"/>
+            </w:tcBorders>
+            <w:tcMar>
+              <w:top w:w="60" w:type="dxa"/>
+              <w:left w:w="90" w:type="dxa"/>
+              <w:bottom w:w="60" w:type="dxa"/>
+              <w:right w:w="90" w:type="dxa"/>
+            </w:tcMar>
+            <w:vAlign w:val="center"/>
+            <w:hideMark/>
+          </w:tcPr>
+          <w:p>
+            <w:r>
+              <w:t>Không chuyển (tập trung)</w:t>
+            </w:r>
+          </w:p>
+        </w:tc>
+      </w:tr>
+    </w:tbl>
+    <w:p>
+      <w:pPr>
+        <w:rPr>
+          <w:lang w:val="en-US"/>
+        </w:rPr>
+      </w:pPr>
+    </w:p>
+    <w:p>
+      <w:pPr>
+        <w:rPr>
+          <w:lang w:val="en-US"/>
+        </w:rPr>
+      </w:pPr>
+      <w:r>
+        <w:rPr>
+          <w:lang w:val="en-US"/>
+        </w:rPr>
+        <w:lastRenderedPageBreak/>
+        <w:drawing>
+          <wp:inline distT="0" distB="0" distL="0" distR="0" wp14:anchorId="63708628" wp14:editId="06BD887C">
+            <wp:extent cx="2803071" cy="2502100"/>
+            <wp:effectExtent l="0" t="0" r="0" b="0"/>
+            <wp:docPr id="1293162450" name="Picture 1"/>
+            <wp:cNvGraphicFramePr>
+              <a:graphicFrameLocks xmlns:a="http://schemas.openxmlformats.org/drawingml/2006/main" noChangeAspect="1"/>
+            </wp:cNvGraphicFramePr>
+            <a:graphic xmlns:a="http://schemas.openxmlformats.org/drawingml/2006/main">
+              <a:graphicData uri="http://schemas.openxmlformats.org/drawingml/2006/picture">
+                <pic:pic xmlns:pic="http://schemas.openxmlformats.org/drawingml/2006/picture">
+                  <pic:nvPicPr>
+                    <pic:cNvPr id="1293162450" name=""/>
+                    <pic:cNvPicPr/>
+                  </pic:nvPicPr>
+                  <pic:blipFill>
+                    <a:blip r:embed="rId43"/>
+                    <a:stretch>
+                      <a:fillRect/>
+                    </a:stretch>
+                  </pic:blipFill>
+                  <pic:spPr>
+                    <a:xfrm>
+                      <a:off x="0" y="0"/>
+                      <a:ext cx="2824076" cy="2520849"/>
+                    </a:xfrm>
+                    <a:prstGeom prst="rect">
+                      <a:avLst/>
+                    </a:prstGeom>
+                  </pic:spPr>
+                </pic:pic>
+              </a:graphicData>
+            </a:graphic>
+          </wp:inline>
+        </w:drawing>
+      </w:r>
+      <w:r>
+        <w:rPr>
+          <w:lang w:val="en-US"/>
+        </w:rPr>
+        <w:drawing>
+          <wp:inline distT="0" distB="0" distL="0" distR="0" wp14:anchorId="64455973" wp14:editId="19916306">
+            <wp:extent cx="3031671" cy="2195046"/>
+            <wp:effectExtent l="0" t="0" r="0" b="0"/>
+            <wp:docPr id="211246253" name="Picture 1"/>
+            <wp:cNvGraphicFramePr>
+              <a:graphicFrameLocks xmlns:a="http://schemas.openxmlformats.org/drawingml/2006/main" noChangeAspect="1"/>
+            </wp:cNvGraphicFramePr>
+            <a:graphic xmlns:a="http://schemas.openxmlformats.org/drawingml/2006/main">
+              <a:graphicData uri="http://schemas.openxmlformats.org/drawingml/2006/picture">
+                <pic:pic xmlns:pic="http://schemas.openxmlformats.org/drawingml/2006/picture">
+                  <pic:nvPicPr>
+                    <pic:cNvPr id="211246253" name=""/>
+                    <pic:cNvPicPr/>
+                  </pic:nvPicPr>
+                  <pic:blipFill>
+                    <a:blip r:embed="rId44"/>
+                    <a:stretch>
+                      <a:fillRect/>
+                    </a:stretch>
+                  </pic:blipFill>
+                  <pic:spPr>
+                    <a:xfrm>
+                      <a:off x="0" y="0"/>
+                      <a:ext cx="3043900" cy="2203900"/>
+                    </a:xfrm>
+                    <a:prstGeom prst="rect">
+                      <a:avLst/>
+                    </a:prstGeom>
+                  </pic:spPr>
+                </pic:pic>
+              </a:graphicData>
+            </a:graphic>
+          </wp:inline>
+        </w:drawing>
+      </w:r>
+    </w:p>
+    <w:p>
+      <w:pPr>
+        <w:rPr>
+          <w:lang w:val="en-US"/>
+        </w:rPr>
+      </w:pPr>
+      <w:r>
+        <w:rPr>
+          <w:lang w:val="en-US"/>
+        </w:rPr>
+        <w:drawing>
+          <wp:inline distT="0" distB="0" distL="0" distR="0" wp14:anchorId="7922C420" wp14:editId="74489B59">
+            <wp:extent cx="2601686" cy="1912628"/>
+            <wp:effectExtent l="0" t="0" r="8255" b="0"/>
+            <wp:docPr id="25026018" name="Picture 1"/>
+            <wp:cNvGraphicFramePr>
+              <a:graphicFrameLocks xmlns:a="http://schemas.openxmlformats.org/drawingml/2006/main" noChangeAspect="1"/>
+            </wp:cNvGraphicFramePr>
+            <a:graphic xmlns:a="http://schemas.openxmlformats.org/drawingml/2006/main">
+              <a:graphicData uri="http://schemas.openxmlformats.org/drawingml/2006/picture">
+                <pic:pic xmlns:pic="http://schemas.openxmlformats.org/drawingml/2006/picture">
+                  <pic:nvPicPr>
+                    <pic:cNvPr id="25026018" name=""/>
+                    <pic:cNvPicPr/>
+                  </pic:nvPicPr>
+                  <pic:blipFill>
+                    <a:blip r:embed="rId45"/>
+                    <a:stretch>
+                      <a:fillRect/>
+                    </a:stretch>
+                  </pic:blipFill>
+                  <pic:spPr>
+                    <a:xfrm>
+                      <a:off x="0" y="0"/>
+                      <a:ext cx="2622560" cy="1927973"/>
+                    </a:xfrm>
+                    <a:prstGeom prst="rect">
+                      <a:avLst/>
+                    </a:prstGeom>
+                  </pic:spPr>
+                </pic:pic>
+              </a:graphicData>
+            </a:graphic>
+          </wp:inline>
+        </w:drawing>
+      </w:r>
+      <w:r>
+        <w:rPr>
+          <w:lang w:val="en-US"/>
+        </w:rPr>
+        <w:drawing>
+          <wp:inline distT="0" distB="0" distL="0" distR="0" wp14:anchorId="20E9CE33" wp14:editId="773BF76A">
+            <wp:extent cx="2823482" cy="1977084"/>
+            <wp:effectExtent l="0" t="0" r="0" b="4445"/>
+            <wp:docPr id="563955591" name="Picture 1"/>
+            <wp:cNvGraphicFramePr>
+              <a:graphicFrameLocks xmlns:a="http://schemas.openxmlformats.org/drawingml/2006/main" noChangeAspect="1"/>
+            </wp:cNvGraphicFramePr>
+            <a:graphic xmlns:a="http://schemas.openxmlformats.org/drawingml/2006/main">
+              <a:graphicData uri="http://schemas.openxmlformats.org/drawingml/2006/picture">
+                <pic:pic xmlns:pic="http://schemas.openxmlformats.org/drawingml/2006/picture">
+                  <pic:nvPicPr>
+                    <pic:cNvPr id="563955591" name=""/>
+                    <pic:cNvPicPr/>
+                  </pic:nvPicPr>
+                  <pic:blipFill>
+                    <a:blip r:embed="rId46"/>
+                    <a:stretch>
+                      <a:fillRect/>
+                    </a:stretch>
+                  </pic:blipFill>
+                  <pic:spPr>
+                    <a:xfrm>
+                      <a:off x="0" y="0"/>
+                      <a:ext cx="2829777" cy="1981492"/>
+                    </a:xfrm>
+                    <a:prstGeom prst="rect">
+                      <a:avLst/>
+                    </a:prstGeom>
+                  </pic:spPr>
+                </pic:pic>
+              </a:graphicData>
+            </a:graphic>
+          </wp:inline>
+        </w:drawing>
+      </w:r>
+    </w:p>
+    <w:p>
+      <w:pPr>
+        <w:rPr>
+          <w:lang w:val="en-US"/>
+        </w:rPr>
+      </w:pPr>
+      <w:r>
+        <w:rPr>
+          <w:lang w:val="en-US"/>
+        </w:rPr>
+        <w:lastRenderedPageBreak/>
+        <w:drawing>
+          <wp:inline distT="0" distB="0" distL="0" distR="0" wp14:anchorId="020DEFC2" wp14:editId="1A4B5FAA">
+            <wp:extent cx="2525486" cy="1441632"/>
+            <wp:effectExtent l="0" t="0" r="8255" b="6350"/>
+            <wp:docPr id="240034861" name="Picture 1"/>
+            <wp:cNvGraphicFramePr>
+              <a:graphicFrameLocks xmlns:a="http://schemas.openxmlformats.org/drawingml/2006/main" noChangeAspect="1"/>
+            </wp:cNvGraphicFramePr>
+            <a:graphic xmlns:a="http://schemas.openxmlformats.org/drawingml/2006/main">
+              <a:graphicData uri="http://schemas.openxmlformats.org/drawingml/2006/picture">
+                <pic:pic xmlns:pic="http://schemas.openxmlformats.org/drawingml/2006/picture">
+                  <pic:nvPicPr>
+                    <pic:cNvPr id="240034861" name=""/>
+                    <pic:cNvPicPr/>
+                  </pic:nvPicPr>
+                  <pic:blipFill>
+                    <a:blip r:embed="rId47"/>
+                    <a:stretch>
+                      <a:fillRect/>
+                    </a:stretch>
+                  </pic:blipFill>
+                  <pic:spPr>
+                    <a:xfrm>
+                      <a:off x="0" y="0"/>
+                      <a:ext cx="2550849" cy="1456110"/>
+                    </a:xfrm>
+                    <a:prstGeom prst="rect">
+                      <a:avLst/>
+                    </a:prstGeom>
+                  </pic:spPr>
+                </pic:pic>
+              </a:graphicData>
+            </a:graphic>
+          </wp:inline>
+        </w:drawing>
+      </w:r>
+      <w:r>
+        <w:rPr>
+          <w:lang w:val="en-US"/>
+        </w:rPr>
+        <w:drawing>
+          <wp:inline distT="0" distB="0" distL="0" distR="0" wp14:anchorId="70E2A0BE" wp14:editId="540ACBA5">
+            <wp:extent cx="3135086" cy="1751428"/>
+            <wp:effectExtent l="0" t="0" r="8255" b="1270"/>
+            <wp:docPr id="1096336726" name="Picture 1"/>
+            <wp:cNvGraphicFramePr>
+              <a:graphicFrameLocks xmlns:a="http://schemas.openxmlformats.org/drawingml/2006/main" noChangeAspect="1"/>
+            </wp:cNvGraphicFramePr>
+            <a:graphic xmlns:a="http://schemas.openxmlformats.org/drawingml/2006/main">
+              <a:graphicData uri="http://schemas.openxmlformats.org/drawingml/2006/picture">
+                <pic:pic xmlns:pic="http://schemas.openxmlformats.org/drawingml/2006/picture">
+                  <pic:nvPicPr>
+                    <pic:cNvPr id="1096336726" name=""/>
+                    <pic:cNvPicPr/>
+                  </pic:nvPicPr>
+                  <pic:blipFill>
+                    <a:blip r:embed="rId48"/>
+                    <a:stretch>
+                      <a:fillRect/>
+                    </a:stretch>
+                  </pic:blipFill>
+                  <pic:spPr>
+                    <a:xfrm>
+                      <a:off x="0" y="0"/>
+                      <a:ext cx="3143688" cy="1756233"/>
+                    </a:xfrm>
+                    <a:prstGeom prst="rect">
+                      <a:avLst/>
+                    </a:prstGeom>
+                  </pic:spPr>
+                </pic:pic>
+              </a:graphicData>
+            </a:graphic>
+          </wp:inline>
+        </w:drawing>
+      </w:r>
+      <w:r>
+        <w:rPr>
+          <w:lang w:val="en-US"/>
+        </w:rPr>
+        <w:drawing>
+          <wp:inline distT="0" distB="0" distL="0" distR="0" wp14:anchorId="777FF71C" wp14:editId="02573FA8">
+            <wp:extent cx="4288971" cy="4269267"/>
+            <wp:effectExtent l="0" t="0" r="0" b="0"/>
+            <wp:docPr id="493400199" name="Picture 1"/>
+            <wp:cNvGraphicFramePr>
+              <a:graphicFrameLocks xmlns:a="http://schemas.openxmlformats.org/drawingml/2006/main" noChangeAspect="1"/>
+            </wp:cNvGraphicFramePr>
+            <a:graphic xmlns:a="http://schemas.openxmlformats.org/drawingml/2006/main">
+              <a:graphicData uri="http://schemas.openxmlformats.org/drawingml/2006/picture">
+                <pic:pic xmlns:pic="http://schemas.openxmlformats.org/drawingml/2006/picture">
+                  <pic:nvPicPr>
+                    <pic:cNvPr id="493400199" name=""/>
+                    <pic:cNvPicPr/>
+                  </pic:nvPicPr>
+                  <pic:blipFill>
+                    <a:blip r:embed="rId49"/>
+                    <a:stretch>
+                      <a:fillRect/>
+                    </a:stretch>
+                  </pic:blipFill>
+                  <pic:spPr>
+                    <a:xfrm>
+                      <a:off x="0" y="0"/>
+                      <a:ext cx="4299316" cy="4279565"/>
+                    </a:xfrm>
+                    <a:prstGeom prst="rect">
+                      <a:avLst/>
+                    </a:prstGeom>
+                  </pic:spPr>
+                </pic:pic>
+              </a:graphicData>
+            </a:graphic>
+          </wp:inline>
+        </w:drawing>
+      </w:r>
+    </w:p>
+    <w:p>
+      <w:pPr>
+        <w:pStyle w:val="Heading2"/>
+        <w:rPr>
+          <w:lang w:val="en-US"/>
+        </w:rPr>
+      </w:pPr>
+      <w:r>
+        <w:rPr>
+          <w:lang w:val="en-US"/>
+        </w:rPr>
+        <w:t>Strategy Pattern</w:t>
+      </w:r>
+    </w:p>
+    <w:p>
+      <w:pPr>
+        <w:rPr>
+          <w:b/>
+          <w:bCs/>
+        </w:rPr>
+      </w:pPr>
+      <w:r>
+        <w:rPr>
+          <w:b/>
+          <w:bCs/>
+        </w:rPr>
+        <w:t>ProductTaxStrategy (Interface - Strategy)</w:t>
+      </w:r>
+    </w:p>
+    <w:p>
+      <w:pPr>
+        <w:rPr>
+          <w:lang w:val="en-US"/>
+        </w:rPr>
+      </w:pPr>
+      <w:r>
+        <w:rPr>
+          <w:b/>
+          <w:bCs/>
+        </w:rPr>
+        <w:t>Vai trò:</w:t>
+      </w:r>
+      <w:r>
+        <w:t> Định nghĩa hợp đồng cho tất cả các chiến lược tính thuế.</w:t>
+      </w:r>
+    </w:p>
+    <w:p>
+      <w:pPr>
+        <w:rPr>
+          <w:lang w:val="en-US"/>
+        </w:rPr>
+      </w:pPr>
+    </w:p>
+    <w:p>
+      <w:pPr>
+        <w:rPr>
+          <w:b/>
+          <w:bCs/>
+        </w:rPr>
+      </w:pPr>
+      <w:r>
+        <w:rPr>
+          <w:b/>
+          <w:bCs/>
+        </w:rPr>
+        <w:t>TaxStrategyContext (Context - Bối cảnh)</w:t>
+      </w:r>
+    </w:p>
+    <w:p>
+      <w:r>
+        <w:rPr>
+          <w:b/>
+          <w:bCs/>
+        </w:rPr>
+        <w:t>Vai trò:</w:t>
+      </w:r>
+      <w:r>
+        <w:t> Lưu trữ và quản lý chiến lược hiện tại. Client không cần biết chi tiết từng strategy.</w:t>
+      </w:r>
+    </w:p>
+    <w:p>
+      <w:pPr>
+        <w:rPr>
+          <w:lang w:val="en-US"/>
+        </w:rPr>
+      </w:pPr>
+    </w:p>
+    <w:p>
+      <w:pPr>
+        <w:rPr>
+          <w:lang w:val="en-US"/>
+        </w:rPr>
+      </w:pPr>
+      <w:r>
+        <w:rPr>
+          <w:lang w:val="en-US"/>
+        </w:rPr>
+        <w:lastRenderedPageBreak/>
+        <w:drawing>
+          <wp:inline distT="0" distB="0" distL="0" distR="0" wp14:anchorId="21EAB79E" wp14:editId="3CA57F1A">
+            <wp:extent cx="2950837" cy="2119811"/>
+            <wp:effectExtent l="0" t="0" r="2540" b="0"/>
+            <wp:docPr id="637129903" name="Picture 1"/>
+            <wp:cNvGraphicFramePr>
+              <a:graphicFrameLocks xmlns:a="http://schemas.openxmlformats.org/drawingml/2006/main" noChangeAspect="1"/>
+            </wp:cNvGraphicFramePr>
+            <a:graphic xmlns:a="http://schemas.openxmlformats.org/drawingml/2006/main">
+              <a:graphicData uri="http://schemas.openxmlformats.org/drawingml/2006/picture">
+                <pic:pic xmlns:pic="http://schemas.openxmlformats.org/drawingml/2006/picture">
+                  <pic:nvPicPr>
+                    <pic:cNvPr id="637129903" name=""/>
+                    <pic:cNvPicPr/>
+                  </pic:nvPicPr>
+                  <pic:blipFill>
+                    <a:blip r:embed="rId50"/>
+                    <a:stretch>
+                      <a:fillRect/>
+                    </a:stretch>
+                  </pic:blipFill>
+                  <pic:spPr>
+                    <a:xfrm>
+                      <a:off x="0" y="0"/>
+                      <a:ext cx="2971689" cy="2134791"/>
+                    </a:xfrm>
+                    <a:prstGeom prst="rect">
+                      <a:avLst/>
+                    </a:prstGeom>
+                  </pic:spPr>
+                </pic:pic>
+              </a:graphicData>
+            </a:graphic>
+          </wp:inline>
+        </w:drawing>
+      </w:r>
+      <w:r>
+        <w:rPr>
+          <w:lang w:val="en-US"/>
+        </w:rPr>
+        <w:drawing>
+          <wp:inline distT="0" distB="0" distL="0" distR="0" wp14:anchorId="5DCF87D3" wp14:editId="17D89977">
+            <wp:extent cx="2798247" cy="1132115"/>
+            <wp:effectExtent l="0" t="0" r="2540" b="0"/>
+            <wp:docPr id="2119355447" name="Picture 1"/>
+            <wp:cNvGraphicFramePr>
+              <a:graphicFrameLocks xmlns:a="http://schemas.openxmlformats.org/drawingml/2006/main" noChangeAspect="1"/>
+            </wp:cNvGraphicFramePr>
+            <a:graphic xmlns:a="http://schemas.openxmlformats.org/drawingml/2006/main">
+              <a:graphicData uri="http://schemas.openxmlformats.org/drawingml/2006/picture">
+                <pic:pic xmlns:pic="http://schemas.openxmlformats.org/drawingml/2006/picture">
+                  <pic:nvPicPr>
+                    <pic:cNvPr id="2119355447" name=""/>
+                    <pic:cNvPicPr/>
+                  </pic:nvPicPr>
+                  <pic:blipFill>
+                    <a:blip r:embed="rId51"/>
+                    <a:stretch>
+                      <a:fillRect/>
+                    </a:stretch>
+                  </pic:blipFill>
+                  <pic:spPr>
+                    <a:xfrm>
+                      <a:off x="0" y="0"/>
+                      <a:ext cx="2824618" cy="1142784"/>
+                    </a:xfrm>
+                    <a:prstGeom prst="rect">
+                      <a:avLst/>
+                    </a:prstGeom>
+                  </pic:spPr>
+                </pic:pic>
+              </a:graphicData>
+            </a:graphic>
+          </wp:inline>
+        </w:drawing>
+      </w:r>
+      <w:r>
+        <w:rPr>
+          <w:lang w:val="en-US"/>
+        </w:rPr>
+        <w:drawing>
+          <wp:inline distT="0" distB="0" distL="0" distR="0" wp14:anchorId="129F696F" wp14:editId="48BFAE47">
+            <wp:extent cx="2903108" cy="1870892"/>
+            <wp:effectExtent l="0" t="0" r="0" b="0"/>
+            <wp:docPr id="541669689" name="Picture 1"/>
+            <wp:cNvGraphicFramePr>
+              <a:graphicFrameLocks xmlns:a="http://schemas.openxmlformats.org/drawingml/2006/main" noChangeAspect="1"/>
+            </wp:cNvGraphicFramePr>
+            <a:graphic xmlns:a="http://schemas.openxmlformats.org/drawingml/2006/main">
+              <a:graphicData uri="http://schemas.openxmlformats.org/drawingml/2006/picture">
+                <pic:pic xmlns:pic="http://schemas.openxmlformats.org/drawingml/2006/picture">
+                  <pic:nvPicPr>
+                    <pic:cNvPr id="541669689" name=""/>
+                    <pic:cNvPicPr/>
+                  </pic:nvPicPr>
+                  <pic:blipFill>
+                    <a:blip r:embed="rId52"/>
+                    <a:stretch>
+                      <a:fillRect/>
+                    </a:stretch>
+                  </pic:blipFill>
+                  <pic:spPr>
+                    <a:xfrm>
+                      <a:off x="0" y="0"/>
+                      <a:ext cx="2918255" cy="1880653"/>
+                    </a:xfrm>
+                    <a:prstGeom prst="rect">
+                      <a:avLst/>
+                    </a:prstGeom>
+                  </pic:spPr>
+                </pic:pic>
+              </a:graphicData>
+            </a:graphic>
+          </wp:inline>
+        </w:drawing>
+      </w:r>
+      <w:r>
+        <w:rPr>
+          <w:lang w:val="en-US"/>
+        </w:rPr>
+        <w:drawing>
+          <wp:inline distT="0" distB="0" distL="0" distR="0" wp14:anchorId="3FA2A341" wp14:editId="56C2F690">
+            <wp:extent cx="2980168" cy="2222390"/>
+            <wp:effectExtent l="0" t="0" r="0" b="6985"/>
+            <wp:docPr id="974508838" name="Picture 1"/>
+            <wp:cNvGraphicFramePr>
+              <a:graphicFrameLocks xmlns:a="http://schemas.openxmlformats.org/drawingml/2006/main" noChangeAspect="1"/>
+            </wp:cNvGraphicFramePr>
+            <a:graphic xmlns:a="http://schemas.openxmlformats.org/drawingml/2006/main">
+              <a:graphicData uri="http://schemas.openxmlformats.org/drawingml/2006/picture">
+                <pic:pic xmlns:pic="http://schemas.openxmlformats.org/drawingml/2006/picture">
+                  <pic:nvPicPr>
+                    <pic:cNvPr id="974508838" name=""/>
+                    <pic:cNvPicPr/>
+                  </pic:nvPicPr>
+                  <pic:blipFill>
+                    <a:blip r:embed="rId53"/>
+                    <a:stretch>
+                      <a:fillRect/>
+                    </a:stretch>
+                  </pic:blipFill>
+                  <pic:spPr>
+                    <a:xfrm>
+                      <a:off x="0" y="0"/>
+                      <a:ext cx="3003005" cy="2239420"/>
+                    </a:xfrm>
+                    <a:prstGeom prst="rect">
+                      <a:avLst/>
+                    </a:prstGeom>
+                  </pic:spPr>
+                </pic:pic>
+              </a:graphicData>
+            </a:graphic>
+          </wp:inline>
+        </w:drawing>
+      </w:r>
+      <w:r>
+        <w:rPr>
+          <w:lang w:val="en-US"/>
+        </w:rPr>
+        <w:drawing>
+          <wp:inline distT="0" distB="0" distL="0" distR="0" wp14:anchorId="258F88CB" wp14:editId="11A8DEF4">
+            <wp:extent cx="2828292" cy="2144486"/>
+            <wp:effectExtent l="0" t="0" r="0" b="8255"/>
+            <wp:docPr id="823597344" name="Picture 1"/>
+            <wp:cNvGraphicFramePr>
+              <a:graphicFrameLocks xmlns:a="http://schemas.openxmlformats.org/drawingml/2006/main" noChangeAspect="1"/>
+            </wp:cNvGraphicFramePr>
+            <a:graphic xmlns:a="http://schemas.openxmlformats.org/drawingml/2006/main">
+              <a:graphicData uri="http://schemas.openxmlformats.org/drawingml/2006/picture">
+                <pic:pic xmlns:pic="http://schemas.openxmlformats.org/drawingml/2006/picture">
+                  <pic:nvPicPr>
+                    <pic:cNvPr id="823597344" name=""/>
+                    <pic:cNvPicPr/>
+                  </pic:nvPicPr>
+                  <pic:blipFill>
+                    <a:blip r:embed="rId54"/>
+                    <a:stretch>
+                      <a:fillRect/>
+                    </a:stretch>
+                  </pic:blipFill>
+                  <pic:spPr>
+                    <a:xfrm>
+                      <a:off x="0" y="0"/>
+                      <a:ext cx="2839727" cy="2153156"/>
+                    </a:xfrm>
+                    <a:prstGeom prst="rect">
+                      <a:avLst/>
+                    </a:prstGeom>
+                  </pic:spPr>
+                </pic:pic>
+              </a:graphicData>
+            </a:graphic>
+          </wp:inline>
+        </w:drawing>
+      </w:r>
+      <w:r>
+        <w:rPr>
+          <w:lang w:val="en-US"/>
+        </w:rPr>
+        <w:drawing>
+          <wp:inline distT="0" distB="0" distL="0" distR="0" wp14:anchorId="71155861" wp14:editId="2945DF47">
+            <wp:extent cx="2911825" cy="2237377"/>
+            <wp:effectExtent l="0" t="0" r="3175" b="0"/>
+            <wp:docPr id="1194345191" name="Picture 1"/>
+            <wp:cNvGraphicFramePr>
+              <a:graphicFrameLocks xmlns:a="http://schemas.openxmlformats.org/drawingml/2006/main" noChangeAspect="1"/>
+            </wp:cNvGraphicFramePr>
+            <a:graphic xmlns:a="http://schemas.openxmlformats.org/drawingml/2006/main">
+              <a:graphicData uri="http://schemas.openxmlformats.org/drawingml/2006/picture">
+                <pic:pic xmlns:pic="http://schemas.openxmlformats.org/drawingml/2006/picture">
+                  <pic:nvPicPr>
+                    <pic:cNvPr id="1194345191" name=""/>
+                    <pic:cNvPicPr/>
+                  </pic:nvPicPr>
+                  <pic:blipFill>
+                    <a:blip r:embed="rId55"/>
+                    <a:stretch>
+                      <a:fillRect/>
+                    </a:stretch>
+                  </pic:blipFill>
+                  <pic:spPr>
+                    <a:xfrm>
+                      <a:off x="0" y="0"/>
+                      <a:ext cx="2920337" cy="2243918"/>
+                    </a:xfrm>
+                    <a:prstGeom prst="rect">
+                      <a:avLst/>
+                    </a:prstGeom>
+                  </pic:spPr>
+                </pic:pic>
+              </a:graphicData>
+            </a:graphic>
+          </wp:inline>
+        </w:drawing>
+      </w:r>
+    </w:p>
+    <w:p>
+      <w:pPr>
+        <w:ind w:firstLine="272"/>
+        <w:rPr>
+          <w:lang w:val="en-US"/>
+        </w:rPr>
+      </w:pPr>
+      <w:r>
+        <w:rPr>
+          <w:lang w:val="en-US"/>
+        </w:rPr>
+        <w:br w:type="page"/>
+      </w:r>
+    </w:p>
+    <w:p>
+      <w:pPr>
+        <w:pStyle w:val="Heading2"/>
+        <w:rPr>
+          <w:lang w:val="en-US"/>
+        </w:rPr>
+      </w:pPr>
+      <w:r>
+        <w:rPr>
+          <w:lang w:val="en-US"/>
+        </w:rPr>
+        <w:lastRenderedPageBreak/>
+        <w:t>Decorator Pattern</w:t>
+      </w:r>
+    </w:p>
+    <w:p>
+      <w:pPr>
+        <w:rPr>
+          <w:b/>
+          <w:bCs/>
+        </w:rPr>
+      </w:pPr>
+      <w:r>
+        <w:rPr>
+          <w:b/>
+          <w:bCs/>
+          <w:lang w:val="en-US"/>
+        </w:rPr>
+        <w:t xml:space="preserve">- </w:t>
+      </w:r>
+      <w:r>
+        <w:rPr>
+          <w:b/>
+          <w:bCs/>
+          <w:lang w:val="en-US"/>
+        </w:rPr>
+        <w:t>T</w:t>
+      </w:r>
+      <w:r>
+        <w:rPr>
+          <w:b/>
+          <w:bCs/>
+        </w:rPr>
+        <w:t>axComponent (Interface - Component)</w:t>
+      </w:r>
+    </w:p>
+    <w:p>
+      <w:r>
+        <w:rPr>
+          <w:b/>
+          <w:bCs/>
+        </w:rPr>
+        <w:t>Vai trò:</w:t>
+      </w:r>
+      <w:r>
+        <w:t> Định nghĩa hợp đồng cho cả component gốc và các decorator</w:t>
+      </w:r>
+    </w:p>
+    <w:p>
+      <w:pPr>
+        <w:rPr>
+          <w:b/>
+          <w:bCs/>
+        </w:rPr>
+      </w:pPr>
+      <w:r>
+        <w:rPr>
+          <w:lang w:val="en-US"/>
+        </w:rPr>
+        <w:t>-</w:t>
+      </w:r>
+      <w:r>
+        <w:rPr>
+          <w:lang w:val="en-US"/>
+        </w:rPr>
+        <w:t xml:space="preserve"> </w:t>
+      </w:r>
+      <w:r>
+        <w:rPr>
+          <w:b/>
+          <w:bCs/>
+        </w:rPr>
+        <w:t>BaseProductComponent (Concrete Component)</w:t>
+      </w:r>
+    </w:p>
+    <w:p>
+      <w:pPr>
+        <w:rPr>
+          <w:lang w:val="en-US"/>
+        </w:rPr>
+      </w:pPr>
+      <w:r>
+        <w:rPr>
+          <w:b/>
+          <w:bCs/>
+        </w:rPr>
+        <w:t>Vai trò:</w:t>
+      </w:r>
+      <w:r>
+        <w:t> Đối tượng gốc mà các decorator sẽ bọc lấy.</w:t>
+      </w:r>
+    </w:p>
+    <w:p>
+      <w:pPr>
+        <w:rPr>
+          <w:b/>
+          <w:bCs/>
+        </w:rPr>
+      </w:pPr>
+      <w:r>
+        <w:rPr>
+          <w:lang w:val="en-US"/>
+        </w:rPr>
+        <w:t xml:space="preserve">- </w:t>
+      </w:r>
+      <w:r>
+        <w:rPr>
+          <w:b/>
+          <w:bCs/>
+        </w:rPr>
+        <w:t>TaxDecorator (Abstract Decorator)</w:t>
+      </w:r>
+    </w:p>
+    <w:p>
+      <w:r>
+        <w:rPr>
+          <w:b/>
+          <w:bCs/>
+        </w:rPr>
+        <w:t>Vai trò:</w:t>
+      </w:r>
+      <w:r>
+        <w:t> Lớp trung gian giữ tham chiếu đến component được bọc.</w:t>
+      </w:r>
+    </w:p>
+    <w:p>
+      <w:pPr>
+        <w:rPr>
+          <w:lang w:val="en-US"/>
+        </w:rPr>
+      </w:pPr>
+    </w:p>
+    <w:p>
+      <w:pPr>
+        <w:rPr>
+          <w:lang w:val="en-US"/>
+        </w:rPr>
+      </w:pPr>
+      <w:r>
+        <w:rPr>
+          <w:lang w:val="en-US"/>
+        </w:rPr>
+        <w:drawing>
+          <wp:inline distT="0" distB="0" distL="0" distR="0" wp14:anchorId="401B49F7" wp14:editId="1047C0BC">
+            <wp:extent cx="1625514" cy="1556022"/>
+            <wp:effectExtent l="0" t="0" r="0" b="6350"/>
+            <wp:docPr id="2054698771" name="Picture 1"/>
+            <wp:cNvGraphicFramePr>
+              <a:graphicFrameLocks xmlns:a="http://schemas.openxmlformats.org/drawingml/2006/main" noChangeAspect="1"/>
+            </wp:cNvGraphicFramePr>
+            <a:graphic xmlns:a="http://schemas.openxmlformats.org/drawingml/2006/main">
+              <a:graphicData uri="http://schemas.openxmlformats.org/drawingml/2006/picture">
+                <pic:pic xmlns:pic="http://schemas.openxmlformats.org/drawingml/2006/picture">
+                  <pic:nvPicPr>
+                    <pic:cNvPr id="2054698771" name=""/>
+                    <pic:cNvPicPr/>
+                  </pic:nvPicPr>
+                  <pic:blipFill>
+                    <a:blip r:embed="rId56"/>
+                    <a:stretch>
+                      <a:fillRect/>
+                    </a:stretch>
+                  </pic:blipFill>
+                  <pic:spPr>
+                    <a:xfrm>
+                      <a:off x="0" y="0"/>
+                      <a:ext cx="1655406" cy="1584636"/>
+                    </a:xfrm>
+                    <a:prstGeom prst="rect">
+                      <a:avLst/>
+                    </a:prstGeom>
+                  </pic:spPr>
+                </pic:pic>
+              </a:graphicData>
+            </a:graphic>
+          </wp:inline>
+        </w:drawing>
+      </w:r>
+      <w:r>
+        <w:rPr>
+          <w:lang w:val="en-US"/>
+        </w:rPr>
+        <w:drawing>
+          <wp:inline distT="0" distB="0" distL="0" distR="0" wp14:anchorId="13F8B9AE" wp14:editId="56021102">
+            <wp:extent cx="3066668" cy="1351824"/>
+            <wp:effectExtent l="0" t="0" r="635" b="1270"/>
+            <wp:docPr id="585810065" name="Picture 1"/>
+            <wp:cNvGraphicFramePr>
+              <a:graphicFrameLocks xmlns:a="http://schemas.openxmlformats.org/drawingml/2006/main" noChangeAspect="1"/>
+            </wp:cNvGraphicFramePr>
+            <a:graphic xmlns:a="http://schemas.openxmlformats.org/drawingml/2006/main">
+              <a:graphicData uri="http://schemas.openxmlformats.org/drawingml/2006/picture">
+                <pic:pic xmlns:pic="http://schemas.openxmlformats.org/drawingml/2006/picture">
+                  <pic:nvPicPr>
+                    <pic:cNvPr id="585810065" name=""/>
+                    <pic:cNvPicPr/>
+                  </pic:nvPicPr>
+                  <pic:blipFill>
+                    <a:blip r:embed="rId57"/>
+                    <a:stretch>
+                      <a:fillRect/>
+                    </a:stretch>
+                  </pic:blipFill>
+                  <pic:spPr>
+                    <a:xfrm>
+                      <a:off x="0" y="0"/>
+                      <a:ext cx="3083982" cy="1359456"/>
+                    </a:xfrm>
+                    <a:prstGeom prst="rect">
+                      <a:avLst/>
+                    </a:prstGeom>
+                  </pic:spPr>
+                </pic:pic>
+              </a:graphicData>
+            </a:graphic>
+          </wp:inline>
+        </w:drawing>
+      </w:r>
+      <w:r>
+        <w:rPr>
+          <w:lang w:val="en-US"/>
+        </w:rPr>
+        <w:drawing>
+          <wp:inline distT="0" distB="0" distL="0" distR="0" wp14:anchorId="1F64C960" wp14:editId="0FED8C6D">
+            <wp:extent cx="2594811" cy="1650546"/>
+            <wp:effectExtent l="0" t="0" r="0" b="6985"/>
+            <wp:docPr id="610084277" name="Picture 1"/>
+            <wp:cNvGraphicFramePr>
+              <a:graphicFrameLocks xmlns:a="http://schemas.openxmlformats.org/drawingml/2006/main" noChangeAspect="1"/>
+            </wp:cNvGraphicFramePr>
+            <a:graphic xmlns:a="http://schemas.openxmlformats.org/drawingml/2006/main">
+              <a:graphicData uri="http://schemas.openxmlformats.org/drawingml/2006/picture">
+                <pic:pic xmlns:pic="http://schemas.openxmlformats.org/drawingml/2006/picture">
+                  <pic:nvPicPr>
+                    <pic:cNvPr id="610084277" name=""/>
+                    <pic:cNvPicPr/>
+                  </pic:nvPicPr>
+                  <pic:blipFill>
+                    <a:blip r:embed="rId58"/>
+                    <a:stretch>
+                      <a:fillRect/>
+                    </a:stretch>
+                  </pic:blipFill>
+                  <pic:spPr>
+                    <a:xfrm>
+                      <a:off x="0" y="0"/>
+                      <a:ext cx="2610785" cy="1660707"/>
+                    </a:xfrm>
+                    <a:prstGeom prst="rect">
+                      <a:avLst/>
+                    </a:prstGeom>
+                  </pic:spPr>
+                </pic:pic>
+              </a:graphicData>
+            </a:graphic>
+          </wp:inline>
+        </w:drawing>
+      </w:r>
+      <w:r>
+        <w:rPr>
+          <w:lang w:val="en-US"/>
+        </w:rPr>
+        <w:drawing>
+          <wp:inline distT="0" distB="0" distL="0" distR="0" wp14:anchorId="7B6710A7" wp14:editId="658BE3B0">
+            <wp:extent cx="2188028" cy="2048613"/>
+            <wp:effectExtent l="0" t="0" r="3175" b="8890"/>
+            <wp:docPr id="680937456" name="Picture 1"/>
+            <wp:cNvGraphicFramePr>
+              <a:graphicFrameLocks xmlns:a="http://schemas.openxmlformats.org/drawingml/2006/main" noChangeAspect="1"/>
+            </wp:cNvGraphicFramePr>
+            <a:graphic xmlns:a="http://schemas.openxmlformats.org/drawingml/2006/main">
+              <a:graphicData uri="http://schemas.openxmlformats.org/drawingml/2006/picture">
+                <pic:pic xmlns:pic="http://schemas.openxmlformats.org/drawingml/2006/picture">
+                  <pic:nvPicPr>
+                    <pic:cNvPr id="680937456" name=""/>
+                    <pic:cNvPicPr/>
+                  </pic:nvPicPr>
+                  <pic:blipFill>
+                    <a:blip r:embed="rId59"/>
+                    <a:stretch>
+                      <a:fillRect/>
+                    </a:stretch>
+                  </pic:blipFill>
+                  <pic:spPr>
+                    <a:xfrm>
+                      <a:off x="0" y="0"/>
+                      <a:ext cx="2215191" cy="2074045"/>
+                    </a:xfrm>
+                    <a:prstGeom prst="rect">
+                      <a:avLst/>
+                    </a:prstGeom>
+                  </pic:spPr>
+                </pic:pic>
+              </a:graphicData>
+            </a:graphic>
+          </wp:inline>
+        </w:drawing>
+      </w:r>
+      <w:r>
+        <w:rPr>
+          <w:lang w:val="en-US"/>
+        </w:rPr>
+        <w:drawing>
+          <wp:inline distT="0" distB="0" distL="0" distR="0" wp14:anchorId="38EF2AF2" wp14:editId="707B2BE3">
+            <wp:extent cx="2748643" cy="2627601"/>
+            <wp:effectExtent l="0" t="0" r="0" b="1905"/>
+            <wp:docPr id="246525371" name="Picture 1"/>
+            <wp:cNvGraphicFramePr>
+              <a:graphicFrameLocks xmlns:a="http://schemas.openxmlformats.org/drawingml/2006/main" noChangeAspect="1"/>
+            </wp:cNvGraphicFramePr>
+            <a:graphic xmlns:a="http://schemas.openxmlformats.org/drawingml/2006/main">
+              <a:graphicData uri="http://schemas.openxmlformats.org/drawingml/2006/picture">
+                <pic:pic xmlns:pic="http://schemas.openxmlformats.org/drawingml/2006/picture">
+                  <pic:nvPicPr>
+                    <pic:cNvPr id="246525371" name=""/>
+                    <pic:cNvPicPr/>
+                  </pic:nvPicPr>
+                  <pic:blipFill>
+                    <a:blip r:embed="rId60"/>
+                    <a:stretch>
+                      <a:fillRect/>
+                    </a:stretch>
+                  </pic:blipFill>
+                  <pic:spPr>
+                    <a:xfrm>
+                      <a:off x="0" y="0"/>
+                      <a:ext cx="2756368" cy="2634986"/>
+                    </a:xfrm>
+                    <a:prstGeom prst="rect">
+                      <a:avLst/>
+                    </a:prstGeom>
+                  </pic:spPr>
+                </pic:pic>
+              </a:graphicData>
+            </a:graphic>
+          </wp:inline>
+        </w:drawing>
+      </w:r>
+      <w:r>
+        <w:rPr>
+          <w:lang w:val="en-US"/>
+        </w:rPr>
+        <w:drawing>
+          <wp:inline distT="0" distB="0" distL="0" distR="0" wp14:anchorId="397482BF" wp14:editId="0BADC668">
+            <wp:extent cx="2895600" cy="2179125"/>
+            <wp:effectExtent l="0" t="0" r="0" b="0"/>
+            <wp:docPr id="1844986066" name="Picture 1"/>
+            <wp:cNvGraphicFramePr>
+              <a:graphicFrameLocks xmlns:a="http://schemas.openxmlformats.org/drawingml/2006/main" noChangeAspect="1"/>
+            </wp:cNvGraphicFramePr>
+            <a:graphic xmlns:a="http://schemas.openxmlformats.org/drawingml/2006/main">
+              <a:graphicData uri="http://schemas.openxmlformats.org/drawingml/2006/picture">
+                <pic:pic xmlns:pic="http://schemas.openxmlformats.org/drawingml/2006/picture">
+                  <pic:nvPicPr>
+                    <pic:cNvPr id="1844986066" name=""/>
+                    <pic:cNvPicPr/>
+                  </pic:nvPicPr>
+                  <pic:blipFill>
+                    <a:blip r:embed="rId61"/>
+                    <a:stretch>
+                      <a:fillRect/>
+                    </a:stretch>
+                  </pic:blipFill>
+                  <pic:spPr>
+                    <a:xfrm>
+                      <a:off x="0" y="0"/>
+                      <a:ext cx="2898314" cy="2181167"/>
                     </a:xfrm>
                     <a:prstGeom prst="rect">
                       <a:avLst/>
@@ -3448,7 +5688,6 @@
   <w:style w:type="character" w:default="1" w:styleId="DefaultParagraphFont">
     <w:name w:val="Default Paragraph Font"/>
     <w:uiPriority w:val="1"/>
-    <w:semiHidden/>
     <w:unhideWhenUsed/>
   </w:style>
   <w:style w:type="table" w:default="1" w:styleId="TableNormal">
@@ -3762,6 +6001,29 @@
       <w:spacing w:val="5"/>
     </w:rPr>
   </w:style>
+  <w:style w:type="character" w:styleId="Hyperlink">
+    <w:name w:val="Hyperlink"/>
+    <w:basedOn w:val="DefaultParagraphFont"/>
+    <w:uiPriority w:val="99"/>
+    <w:unhideWhenUsed/>
+    <w:rsid w:val="00442E22"/>
+    <w:rPr>
+      <w:color w:val="467886" w:themeColor="hyperlink"/>
+      <w:u w:val="single"/>
+    </w:rPr>
+  </w:style>
+  <w:style w:type="character" w:styleId="UnresolvedMention">
+    <w:name w:val="Unresolved Mention"/>
+    <w:basedOn w:val="DefaultParagraphFont"/>
+    <w:uiPriority w:val="99"/>
+    <w:semiHidden/>
+    <w:unhideWhenUsed/>
+    <w:rsid w:val="00442E22"/>
+    <w:rPr>
+      <w:color w:val="605E5C"/>
+      <w:shd w:val="clear" w:color="auto" w:fill="E1DFDD"/>
+    </w:rPr>
+  </w:style>
 </w:styles>
 </file>
 

</xml_diff>